<commit_message>
Finalize PFA defense report and validation annex
</commit_message>
<xml_diff>
--- a/docs/Annexe_Metriques_Evaluation.docx
+++ b/docs/Annexe_Metriques_Evaluation.docx
@@ -920,7 +920,7 @@
         <w:rPr>
           <w:color w:val="000000"/>
         </w:rPr>
-        <w:t>C'est la partie qui distingue ce projet d'un backtest ordinaire. Ces trois mesures ne disent pas si la performance est bonne : elles disent si elle est CRÉDIBLE.</w:t>
+        <w:t>C'est la partie qui distingue ce projet d'un backtest ordinaire. Ces cinq contrôles ne disent pas si la performance est bonne : ils disent si elle est CRÉDIBLE.</w:t>
       </w:r>
     </w:p>
     <w:p>
@@ -988,7 +988,7 @@
         <w:rPr>
           <w:color w:val="000000"/>
         </w:rPr>
-        <w:t>C'est l'outil d'honnêteté le plus important du projet : il transforme « 1,12 contre 0,97 » en deux intervalles qui se chevauchent, et c'est lui qui empêche de présenter un classement ponctuel comme un fait. Il n'autorise pas pour autant la conclusion inverse : des intervalles MARGINAUX qui se chevauchent ne testent pas la différence entre deux stratégies. Tester cette différence exige un bootstrap PAIRÉ, mené sur les écarts de rendement eux-mêmes — instrument absent de cette annexe et implémenté dans metrics.paired_block_bootstrap, résultats dans data/gold/paired_comparison_results.json.</w:t>
+        <w:t>C'est l'outil d'honnêteté le plus important du projet : il transforme « 1,12 contre 0,97 » en deux intervalles marginaux et empêche de présenter un classement ponctuel comme un fait. Il n'autorise pas pour autant la conclusion inverse : des intervalles MARGINAUX qui se chevauchent ne testent pas la différence entre deux stratégies. Cette différence est traitée par le bootstrap PAIRÉ de la section 4.3.</w:t>
       </w:r>
     </w:p>
     <w:p>
@@ -997,10 +997,7 @@
         <w:spacing w:after="120" w:before="240"/>
       </w:pPr>
       <w:r>
-        <w:rPr>
-          <w:b/>
-        </w:rPr>
-        <w:t>4.3 Registre des essais (DSRTrialLedger)</w:t>
+        <w:t>4.3 Bootstrap pairé sur les différences</w:t>
       </w:r>
     </w:p>
     <w:p>
@@ -1011,7 +1008,69 @@
         <w:rPr>
           <w:color w:val="000000"/>
         </w:rPr>
-        <w:t>Le DSR ne déflate correctement que si N compte TOUTES les configurations évaluées par la recherche, pas seulement celles du tableau final. Le registre persiste le Sharpe par-période de chaque essai dans un fichier JSON inspectable, si bien que N reflète la largeur réelle de la recherche : 36 configurations pour la Phase 5, 198 pour le walk-forward imbriqué. Un balayage qui aurait discrètement testé 200 variantes pour n'en publier qu'une est exactement ce que le DSR existe pour pénaliser.</w:t>
+        <w:t>Lorsqu'il faut comparer deux stratégies, les deux séries de rendements nets sont ré-échantillonnées avec les MÊMES blocs circulaires de 21 jours. Chaque tirage conserve donc la dépendance temporelle de chaque stratégie et leur corrélation le même jour. L'objet testé est directement l'écart de rendement et l'écart de Sharpe, pas le chevauchement de deux intervalles marginaux séparés.</w:t>
+      </w:r>
+    </w:p>
+    <w:p>
+      <w:pPr>
+        <w:spacing w:after="160"/>
+      </w:pPr>
+      <w:r>
+        <w:rPr>
+          <w:color w:val="000000"/>
+        </w:rPr>
+        <w:t>Le résultat publié comprend l'intervalle pairé, une p-value unilatérale centrée sous l'hypothèse nulle d'absence de surperformance et la probabilité descriptive que l'écart de Sharpe soit positif. Une surperformance n'est établie que si l'intervalle exclut zéro et si la p-value respecte le seuil déclaré. Ne pas rejeter l'hypothèse nulle ne démontre jamais l'équivalence : cela exigerait un test dédié contre une marge définie à l'avance.</w:t>
+      </w:r>
+    </w:p>
+    <w:p>
+      <w:pPr>
+        <w:pStyle w:val="Heading1"/>
+        <w:spacing w:after="120" w:before="240"/>
+      </w:pPr>
+      <w:r>
+        <w:t>4.4 Correction du choix parmi de nombreuses variantes</w:t>
+      </w:r>
+    </w:p>
+    <w:p>
+      <w:pPr>
+        <w:spacing w:after="160"/>
+      </w:pPr>
+      <w:r>
+        <w:rPr>
+          <w:color w:val="000000"/>
+        </w:rPr>
+        <w:t>White Reality Check et Hansen SPA testent l'hypothèse composite qu'aucun des 240 candidats atteignables ne surperforme un benchmark sur la fenêtre de test gelée. Toutes les variantes sont évaluées sur les mêmes dates et partagent les mêmes tirages bootstrap : les variantes proches ne sont pas artificiellement traitées comme des paris indépendants.</w:t>
+      </w:r>
+    </w:p>
+    <w:p>
+      <w:pPr>
+        <w:spacing w:after="160"/>
+      </w:pPr>
+      <w:r>
+        <w:rPr>
+          <w:color w:val="000000"/>
+        </w:rPr>
+        <w:t>Le benchmark primaire est fixé avant lecture des p-values : regime_conditional, le système que la couche ML devait améliorer. equal_weight est exploratoire : le battre n'établit pas une valeur ajoutée ML, car le système de régimes et le max_sharpe classique le dépassent déjà. White RC et Hansen SPA sont toujours rapportés ensemble. SPA a retenu 227 à 240 candidats sur 240 ; l'écart avec White vient donc principalement de la studentisation, non d'un élagage massif. Huit comparaisons externes sont rapportées (2 univers, 2 benchmarks, 2 statistiques) sans correction supplémentaire : leurs résultats exploratoires ne doivent pas être sélectionnés a posteriori.</w:t>
+      </w:r>
+    </w:p>
+    <w:p>
+      <w:pPr>
+        <w:pStyle w:val="Heading1"/>
+        <w:spacing w:after="120" w:before="240"/>
+      </w:pPr>
+      <w:r>
+        <w:t>4.5 Registre des essais (DSRTrialLedger)</w:t>
+      </w:r>
+    </w:p>
+    <w:p>
+      <w:pPr>
+        <w:spacing w:after="160"/>
+      </w:pPr>
+      <w:r>
+        <w:rPr>
+          <w:color w:val="000000"/>
+        </w:rPr>
+        <w:t>Le registre rend la recherche inspectable : pour la Phase 5, il consigne 51 essais hiérarchiques (15 configurations de signal évaluées par IC et 36 essais de leviers avec séries de rendements). Ce registre rend visible la sélection, mais il ne remplace pas la correction de recherche de la section 4.4 : celle-ci évalue les 240 chemins de portefeuille atteignables sur la même fenêtre de test gelée.</w:t>
       </w:r>
     </w:p>
     <w:p>
@@ -1380,6 +1439,17 @@
         </w:tc>
       </w:tr>
     </w:tbl>
+    <w:p>
+      <w:pPr>
+        <w:spacing w:after="160"/>
+      </w:pPr>
+      <w:r>
+        <w:rPr>
+          <w:color w:val="000000"/>
+        </w:rPr>
+        <w:t>Lecture d'ensemble. Les sections 4 et 7 séparent une observation historique d'une conclusion établie : ni des intervalles marginaux ni l'absence de rejet ne prouvent l'équivalence.</w:t>
+      </w:r>
+    </w:p>
     <w:p>
       <w:pPr>
         <w:pStyle w:val="Heading1"/>
@@ -1419,19 +1489,24 @@
             <w:tcW w:type="dxa" w:w="2500"/>
             <w:shd w:val="clear" w:fill="DCE6F1"/>
             <w:tcMar>
-              <w:top w:type="dxa" w:w="80"/>
-              <w:left w:type="dxa" w:w="100"/>
-              <w:bottom w:type="dxa" w:w="80"/>
-              <w:right w:type="dxa" w:w="100"/>
-            </w:tcMar>
-            <w:vAlign w:val="center"/>
-          </w:tcPr>
-          <w:p>
+              <w:top w:type="dxa" w:w="30"/>
+              <w:left w:type="dxa" w:w="100"/>
+              <w:bottom w:type="dxa" w:w="30"/>
+              <w:right w:type="dxa" w:w="100"/>
+              <w:start w:w="80" w:type="dxa"/>
+              <w:end w:w="80" w:type="dxa"/>
+            </w:tcMar>
+            <w:vAlign w:val="center"/>
+          </w:tcPr>
+          <w:p>
+            <w:pPr>
+              <w:spacing w:after="0"/>
+            </w:pPr>
             <w:r>
               <w:rPr>
                 <w:b/>
                 <w:bCs/>
-                <w:sz w:val="17"/>
+                <w:sz w:val="20"/>
                 <w:szCs w:val="20"/>
               </w:rPr>
               <w:t>Mesure</w:t>
@@ -1443,19 +1518,24 @@
             <w:tcW w:type="dxa" w:w="1900"/>
             <w:shd w:val="clear" w:fill="DCE6F1"/>
             <w:tcMar>
-              <w:top w:type="dxa" w:w="80"/>
-              <w:left w:type="dxa" w:w="100"/>
-              <w:bottom w:type="dxa" w:w="80"/>
-              <w:right w:type="dxa" w:w="100"/>
-            </w:tcMar>
-            <w:vAlign w:val="center"/>
-          </w:tcPr>
-          <w:p>
+              <w:top w:type="dxa" w:w="30"/>
+              <w:left w:type="dxa" w:w="100"/>
+              <w:bottom w:type="dxa" w:w="30"/>
+              <w:right w:type="dxa" w:w="100"/>
+              <w:start w:w="80" w:type="dxa"/>
+              <w:end w:w="80" w:type="dxa"/>
+            </w:tcMar>
+            <w:vAlign w:val="center"/>
+          </w:tcPr>
+          <w:p>
+            <w:pPr>
+              <w:spacing w:after="0"/>
+            </w:pPr>
             <w:r>
               <w:rPr>
                 <w:b/>
                 <w:bCs/>
-                <w:sz w:val="17"/>
+                <w:sz w:val="20"/>
                 <w:szCs w:val="20"/>
               </w:rPr>
               <w:t>Problème(s)</w:t>
@@ -1467,19 +1547,24 @@
             <w:tcW w:type="dxa" w:w="4626"/>
             <w:shd w:val="clear" w:fill="DCE6F1"/>
             <w:tcMar>
-              <w:top w:type="dxa" w:w="80"/>
-              <w:left w:type="dxa" w:w="100"/>
-              <w:bottom w:type="dxa" w:w="80"/>
-              <w:right w:type="dxa" w:w="100"/>
-            </w:tcMar>
-            <w:vAlign w:val="center"/>
-          </w:tcPr>
-          <w:p>
+              <w:top w:type="dxa" w:w="30"/>
+              <w:left w:type="dxa" w:w="100"/>
+              <w:bottom w:type="dxa" w:w="30"/>
+              <w:right w:type="dxa" w:w="100"/>
+              <w:start w:w="80" w:type="dxa"/>
+              <w:end w:w="80" w:type="dxa"/>
+            </w:tcMar>
+            <w:vAlign w:val="center"/>
+          </w:tcPr>
+          <w:p>
+            <w:pPr>
+              <w:spacing w:after="0"/>
+            </w:pPr>
             <w:r>
               <w:rPr>
                 <w:b/>
                 <w:bCs/>
-                <w:sz w:val="17"/>
+                <w:sz w:val="20"/>
                 <w:szCs w:val="20"/>
               </w:rPr>
               <w:t>Implémentation</w:t>
@@ -1495,19 +1580,24 @@
           <w:tcPr>
             <w:tcW w:type="dxa" w:w="2500"/>
             <w:tcMar>
-              <w:top w:type="dxa" w:w="80"/>
-              <w:left w:type="dxa" w:w="100"/>
-              <w:bottom w:type="dxa" w:w="80"/>
-              <w:right w:type="dxa" w:w="100"/>
-            </w:tcMar>
-            <w:vAlign w:val="center"/>
-          </w:tcPr>
-          <w:p>
-            <w:r>
-              <w:rPr>
-                <w:b w:val="0"/>
-                <w:bCs/>
-                <w:sz w:val="17"/>
+              <w:top w:type="dxa" w:w="30"/>
+              <w:left w:type="dxa" w:w="100"/>
+              <w:bottom w:type="dxa" w:w="30"/>
+              <w:right w:type="dxa" w:w="100"/>
+              <w:start w:w="80" w:type="dxa"/>
+              <w:end w:w="80" w:type="dxa"/>
+            </w:tcMar>
+            <w:vAlign w:val="center"/>
+          </w:tcPr>
+          <w:p>
+            <w:pPr>
+              <w:spacing w:after="0"/>
+            </w:pPr>
+            <w:r>
+              <w:rPr>
+                <w:b w:val="0"/>
+                <w:bCs/>
+                <w:sz w:val="20"/>
                 <w:szCs w:val="20"/>
               </w:rPr>
               <w:t>Rendement annualisé</w:t>
@@ -1518,19 +1608,24 @@
           <w:tcPr>
             <w:tcW w:type="dxa" w:w="1900"/>
             <w:tcMar>
-              <w:top w:type="dxa" w:w="80"/>
-              <w:left w:type="dxa" w:w="100"/>
-              <w:bottom w:type="dxa" w:w="80"/>
-              <w:right w:type="dxa" w:w="100"/>
-            </w:tcMar>
-            <w:vAlign w:val="center"/>
-          </w:tcPr>
-          <w:p>
-            <w:r>
-              <w:rPr>
-                <w:b w:val="0"/>
-                <w:bCs/>
-                <w:sz w:val="17"/>
+              <w:top w:type="dxa" w:w="30"/>
+              <w:left w:type="dxa" w:w="100"/>
+              <w:bottom w:type="dxa" w:w="30"/>
+              <w:right w:type="dxa" w:w="100"/>
+              <w:start w:w="80" w:type="dxa"/>
+              <w:end w:w="80" w:type="dxa"/>
+            </w:tcMar>
+            <w:vAlign w:val="center"/>
+          </w:tcPr>
+          <w:p>
+            <w:pPr>
+              <w:spacing w:after="0"/>
+            </w:pPr>
+            <w:r>
+              <w:rPr>
+                <w:b w:val="0"/>
+                <w:bCs/>
+                <w:sz w:val="20"/>
                 <w:szCs w:val="20"/>
               </w:rPr>
               <w:t>P4</w:t>
@@ -1541,19 +1636,24 @@
           <w:tcPr>
             <w:tcW w:type="dxa" w:w="4626"/>
             <w:tcMar>
-              <w:top w:type="dxa" w:w="80"/>
-              <w:left w:type="dxa" w:w="100"/>
-              <w:bottom w:type="dxa" w:w="80"/>
-              <w:right w:type="dxa" w:w="100"/>
-            </w:tcMar>
-            <w:vAlign w:val="center"/>
-          </w:tcPr>
-          <w:p>
-            <w:r>
-              <w:rPr>
-                <w:b w:val="0"/>
-                <w:bCs/>
-                <w:sz w:val="17"/>
+              <w:top w:type="dxa" w:w="30"/>
+              <w:left w:type="dxa" w:w="100"/>
+              <w:bottom w:type="dxa" w:w="30"/>
+              <w:right w:type="dxa" w:w="100"/>
+              <w:start w:w="80" w:type="dxa"/>
+              <w:end w:w="80" w:type="dxa"/>
+            </w:tcMar>
+            <w:vAlign w:val="center"/>
+          </w:tcPr>
+          <w:p>
+            <w:pPr>
+              <w:spacing w:after="0"/>
+            </w:pPr>
+            <w:r>
+              <w:rPr>
+                <w:b w:val="0"/>
+                <w:bCs/>
+                <w:sz w:val="20"/>
                 <w:szCs w:val="20"/>
               </w:rPr>
               <w:t>metrics.py : annualized_return</w:t>
@@ -1569,19 +1669,24 @@
           <w:tcPr>
             <w:tcW w:type="dxa" w:w="2500"/>
             <w:tcMar>
-              <w:top w:type="dxa" w:w="80"/>
-              <w:left w:type="dxa" w:w="100"/>
-              <w:bottom w:type="dxa" w:w="80"/>
-              <w:right w:type="dxa" w:w="100"/>
-            </w:tcMar>
-            <w:vAlign w:val="center"/>
-          </w:tcPr>
-          <w:p>
-            <w:r>
-              <w:rPr>
-                <w:b w:val="0"/>
-                <w:bCs/>
-                <w:sz w:val="17"/>
+              <w:top w:type="dxa" w:w="30"/>
+              <w:left w:type="dxa" w:w="100"/>
+              <w:bottom w:type="dxa" w:w="30"/>
+              <w:right w:type="dxa" w:w="100"/>
+              <w:start w:w="80" w:type="dxa"/>
+              <w:end w:w="80" w:type="dxa"/>
+            </w:tcMar>
+            <w:vAlign w:val="center"/>
+          </w:tcPr>
+          <w:p>
+            <w:pPr>
+              <w:spacing w:after="0"/>
+            </w:pPr>
+            <w:r>
+              <w:rPr>
+                <w:b w:val="0"/>
+                <w:bCs/>
+                <w:sz w:val="20"/>
                 <w:szCs w:val="20"/>
               </w:rPr>
               <w:t>Sharpe annualisé</w:t>
@@ -1592,19 +1697,24 @@
           <w:tcPr>
             <w:tcW w:type="dxa" w:w="1900"/>
             <w:tcMar>
-              <w:top w:type="dxa" w:w="80"/>
-              <w:left w:type="dxa" w:w="100"/>
-              <w:bottom w:type="dxa" w:w="80"/>
-              <w:right w:type="dxa" w:w="100"/>
-            </w:tcMar>
-            <w:vAlign w:val="center"/>
-          </w:tcPr>
-          <w:p>
-            <w:r>
-              <w:rPr>
-                <w:b w:val="0"/>
-                <w:bCs/>
-                <w:sz w:val="17"/>
+              <w:top w:type="dxa" w:w="30"/>
+              <w:left w:type="dxa" w:w="100"/>
+              <w:bottom w:type="dxa" w:w="30"/>
+              <w:right w:type="dxa" w:w="100"/>
+              <w:start w:w="80" w:type="dxa"/>
+              <w:end w:w="80" w:type="dxa"/>
+            </w:tcMar>
+            <w:vAlign w:val="center"/>
+          </w:tcPr>
+          <w:p>
+            <w:pPr>
+              <w:spacing w:after="0"/>
+            </w:pPr>
+            <w:r>
+              <w:rPr>
+                <w:b w:val="0"/>
+                <w:bCs/>
+                <w:sz w:val="20"/>
                 <w:szCs w:val="20"/>
               </w:rPr>
               <w:t>P4</w:t>
@@ -1615,19 +1725,24 @@
           <w:tcPr>
             <w:tcW w:type="dxa" w:w="4626"/>
             <w:tcMar>
-              <w:top w:type="dxa" w:w="80"/>
-              <w:left w:type="dxa" w:w="100"/>
-              <w:bottom w:type="dxa" w:w="80"/>
-              <w:right w:type="dxa" w:w="100"/>
-            </w:tcMar>
-            <w:vAlign w:val="center"/>
-          </w:tcPr>
-          <w:p>
-            <w:r>
-              <w:rPr>
-                <w:b w:val="0"/>
-                <w:bCs/>
-                <w:sz w:val="17"/>
+              <w:top w:type="dxa" w:w="30"/>
+              <w:left w:type="dxa" w:w="100"/>
+              <w:bottom w:type="dxa" w:w="30"/>
+              <w:right w:type="dxa" w:w="100"/>
+              <w:start w:w="80" w:type="dxa"/>
+              <w:end w:w="80" w:type="dxa"/>
+            </w:tcMar>
+            <w:vAlign w:val="center"/>
+          </w:tcPr>
+          <w:p>
+            <w:pPr>
+              <w:spacing w:after="0"/>
+            </w:pPr>
+            <w:r>
+              <w:rPr>
+                <w:b w:val="0"/>
+                <w:bCs/>
+                <w:sz w:val="20"/>
                 <w:szCs w:val="20"/>
               </w:rPr>
               <w:t>metrics.py : annualized_sharpe</w:t>
@@ -1643,19 +1758,24 @@
           <w:tcPr>
             <w:tcW w:type="dxa" w:w="2500"/>
             <w:tcMar>
-              <w:top w:type="dxa" w:w="80"/>
-              <w:left w:type="dxa" w:w="100"/>
-              <w:bottom w:type="dxa" w:w="80"/>
-              <w:right w:type="dxa" w:w="100"/>
-            </w:tcMar>
-            <w:vAlign w:val="center"/>
-          </w:tcPr>
-          <w:p>
-            <w:r>
-              <w:rPr>
-                <w:b w:val="0"/>
-                <w:bCs/>
-                <w:sz w:val="17"/>
+              <w:top w:type="dxa" w:w="30"/>
+              <w:left w:type="dxa" w:w="100"/>
+              <w:bottom w:type="dxa" w:w="30"/>
+              <w:right w:type="dxa" w:w="100"/>
+              <w:start w:w="80" w:type="dxa"/>
+              <w:end w:w="80" w:type="dxa"/>
+            </w:tcMar>
+            <w:vAlign w:val="center"/>
+          </w:tcPr>
+          <w:p>
+            <w:pPr>
+              <w:spacing w:after="0"/>
+            </w:pPr>
+            <w:r>
+              <w:rPr>
+                <w:b w:val="0"/>
+                <w:bCs/>
+                <w:sz w:val="20"/>
                 <w:szCs w:val="20"/>
               </w:rPr>
               <w:t>Drawdown maximal</w:t>
@@ -1666,19 +1786,24 @@
           <w:tcPr>
             <w:tcW w:type="dxa" w:w="1900"/>
             <w:tcMar>
-              <w:top w:type="dxa" w:w="80"/>
-              <w:left w:type="dxa" w:w="100"/>
-              <w:bottom w:type="dxa" w:w="80"/>
-              <w:right w:type="dxa" w:w="100"/>
-            </w:tcMar>
-            <w:vAlign w:val="center"/>
-          </w:tcPr>
-          <w:p>
-            <w:r>
-              <w:rPr>
-                <w:b w:val="0"/>
-                <w:bCs/>
-                <w:sz w:val="17"/>
+              <w:top w:type="dxa" w:w="30"/>
+              <w:left w:type="dxa" w:w="100"/>
+              <w:bottom w:type="dxa" w:w="30"/>
+              <w:right w:type="dxa" w:w="100"/>
+              <w:start w:w="80" w:type="dxa"/>
+              <w:end w:w="80" w:type="dxa"/>
+            </w:tcMar>
+            <w:vAlign w:val="center"/>
+          </w:tcPr>
+          <w:p>
+            <w:pPr>
+              <w:spacing w:after="0"/>
+            </w:pPr>
+            <w:r>
+              <w:rPr>
+                <w:b w:val="0"/>
+                <w:bCs/>
+                <w:sz w:val="20"/>
                 <w:szCs w:val="20"/>
               </w:rPr>
               <w:t>P3, P4</w:t>
@@ -1689,19 +1814,24 @@
           <w:tcPr>
             <w:tcW w:type="dxa" w:w="4626"/>
             <w:tcMar>
-              <w:top w:type="dxa" w:w="80"/>
-              <w:left w:type="dxa" w:w="100"/>
-              <w:bottom w:type="dxa" w:w="80"/>
-              <w:right w:type="dxa" w:w="100"/>
-            </w:tcMar>
-            <w:vAlign w:val="center"/>
-          </w:tcPr>
-          <w:p>
-            <w:r>
-              <w:rPr>
-                <w:b w:val="0"/>
-                <w:bCs/>
-                <w:sz w:val="17"/>
+              <w:top w:type="dxa" w:w="30"/>
+              <w:left w:type="dxa" w:w="100"/>
+              <w:bottom w:type="dxa" w:w="30"/>
+              <w:right w:type="dxa" w:w="100"/>
+              <w:start w:w="80" w:type="dxa"/>
+              <w:end w:w="80" w:type="dxa"/>
+            </w:tcMar>
+            <w:vAlign w:val="center"/>
+          </w:tcPr>
+          <w:p>
+            <w:pPr>
+              <w:spacing w:after="0"/>
+            </w:pPr>
+            <w:r>
+              <w:rPr>
+                <w:b w:val="0"/>
+                <w:bCs/>
+                <w:sz w:val="20"/>
                 <w:szCs w:val="20"/>
               </w:rPr>
               <w:t>metrics.py : max_drawdown</w:t>
@@ -1717,19 +1847,24 @@
           <w:tcPr>
             <w:tcW w:type="dxa" w:w="2500"/>
             <w:tcMar>
-              <w:top w:type="dxa" w:w="80"/>
-              <w:left w:type="dxa" w:w="100"/>
-              <w:bottom w:type="dxa" w:w="80"/>
-              <w:right w:type="dxa" w:w="100"/>
-            </w:tcMar>
-            <w:vAlign w:val="center"/>
-          </w:tcPr>
-          <w:p>
-            <w:r>
-              <w:rPr>
-                <w:b w:val="0"/>
-                <w:bCs/>
-                <w:sz w:val="17"/>
+              <w:top w:type="dxa" w:w="30"/>
+              <w:left w:type="dxa" w:w="100"/>
+              <w:bottom w:type="dxa" w:w="30"/>
+              <w:right w:type="dxa" w:w="100"/>
+              <w:start w:w="80" w:type="dxa"/>
+              <w:end w:w="80" w:type="dxa"/>
+            </w:tcMar>
+            <w:vAlign w:val="center"/>
+          </w:tcPr>
+          <w:p>
+            <w:pPr>
+              <w:spacing w:after="0"/>
+            </w:pPr>
+            <w:r>
+              <w:rPr>
+                <w:b w:val="0"/>
+                <w:bCs/>
+                <w:sz w:val="20"/>
                 <w:szCs w:val="20"/>
               </w:rPr>
               <w:t>Ratio de Calmar</w:t>
@@ -1740,19 +1875,24 @@
           <w:tcPr>
             <w:tcW w:type="dxa" w:w="1900"/>
             <w:tcMar>
-              <w:top w:type="dxa" w:w="80"/>
-              <w:left w:type="dxa" w:w="100"/>
-              <w:bottom w:type="dxa" w:w="80"/>
-              <w:right w:type="dxa" w:w="100"/>
-            </w:tcMar>
-            <w:vAlign w:val="center"/>
-          </w:tcPr>
-          <w:p>
-            <w:r>
-              <w:rPr>
-                <w:b w:val="0"/>
-                <w:bCs/>
-                <w:sz w:val="17"/>
+              <w:top w:type="dxa" w:w="30"/>
+              <w:left w:type="dxa" w:w="100"/>
+              <w:bottom w:type="dxa" w:w="30"/>
+              <w:right w:type="dxa" w:w="100"/>
+              <w:start w:w="80" w:type="dxa"/>
+              <w:end w:w="80" w:type="dxa"/>
+            </w:tcMar>
+            <w:vAlign w:val="center"/>
+          </w:tcPr>
+          <w:p>
+            <w:pPr>
+              <w:spacing w:after="0"/>
+            </w:pPr>
+            <w:r>
+              <w:rPr>
+                <w:b w:val="0"/>
+                <w:bCs/>
+                <w:sz w:val="20"/>
                 <w:szCs w:val="20"/>
               </w:rPr>
               <w:t>P4</w:t>
@@ -1763,19 +1903,24 @@
           <w:tcPr>
             <w:tcW w:type="dxa" w:w="4626"/>
             <w:tcMar>
-              <w:top w:type="dxa" w:w="80"/>
-              <w:left w:type="dxa" w:w="100"/>
-              <w:bottom w:type="dxa" w:w="80"/>
-              <w:right w:type="dxa" w:w="100"/>
-            </w:tcMar>
-            <w:vAlign w:val="center"/>
-          </w:tcPr>
-          <w:p>
-            <w:r>
-              <w:rPr>
-                <w:b w:val="0"/>
-                <w:bCs/>
-                <w:sz w:val="17"/>
+              <w:top w:type="dxa" w:w="30"/>
+              <w:left w:type="dxa" w:w="100"/>
+              <w:bottom w:type="dxa" w:w="30"/>
+              <w:right w:type="dxa" w:w="100"/>
+              <w:start w:w="80" w:type="dxa"/>
+              <w:end w:w="80" w:type="dxa"/>
+            </w:tcMar>
+            <w:vAlign w:val="center"/>
+          </w:tcPr>
+          <w:p>
+            <w:pPr>
+              <w:spacing w:after="0"/>
+            </w:pPr>
+            <w:r>
+              <w:rPr>
+                <w:b w:val="0"/>
+                <w:bCs/>
+                <w:sz w:val="20"/>
                 <w:szCs w:val="20"/>
               </w:rPr>
               <w:t>metrics.py : calmar_ratio</w:t>
@@ -1791,19 +1936,24 @@
           <w:tcPr>
             <w:tcW w:type="dxa" w:w="2500"/>
             <w:tcMar>
-              <w:top w:type="dxa" w:w="80"/>
-              <w:left w:type="dxa" w:w="100"/>
-              <w:bottom w:type="dxa" w:w="80"/>
-              <w:right w:type="dxa" w:w="100"/>
-            </w:tcMar>
-            <w:vAlign w:val="center"/>
-          </w:tcPr>
-          <w:p>
-            <w:r>
-              <w:rPr>
-                <w:b w:val="0"/>
-                <w:bCs/>
-                <w:sz w:val="17"/>
+              <w:top w:type="dxa" w:w="30"/>
+              <w:left w:type="dxa" w:w="100"/>
+              <w:bottom w:type="dxa" w:w="30"/>
+              <w:right w:type="dxa" w:w="100"/>
+              <w:start w:w="80" w:type="dxa"/>
+              <w:end w:w="80" w:type="dxa"/>
+            </w:tcMar>
+            <w:vAlign w:val="center"/>
+          </w:tcPr>
+          <w:p>
+            <w:pPr>
+              <w:spacing w:after="0"/>
+            </w:pPr>
+            <w:r>
+              <w:rPr>
+                <w:b w:val="0"/>
+                <w:bCs/>
+                <w:sz w:val="20"/>
                 <w:szCs w:val="20"/>
               </w:rPr>
               <w:t>Information ratio</w:t>
@@ -1814,19 +1964,24 @@
           <w:tcPr>
             <w:tcW w:type="dxa" w:w="1900"/>
             <w:tcMar>
-              <w:top w:type="dxa" w:w="80"/>
-              <w:left w:type="dxa" w:w="100"/>
-              <w:bottom w:type="dxa" w:w="80"/>
-              <w:right w:type="dxa" w:w="100"/>
-            </w:tcMar>
-            <w:vAlign w:val="center"/>
-          </w:tcPr>
-          <w:p>
-            <w:r>
-              <w:rPr>
-                <w:b w:val="0"/>
-                <w:bCs/>
-                <w:sz w:val="17"/>
+              <w:top w:type="dxa" w:w="30"/>
+              <w:left w:type="dxa" w:w="100"/>
+              <w:bottom w:type="dxa" w:w="30"/>
+              <w:right w:type="dxa" w:w="100"/>
+              <w:start w:w="80" w:type="dxa"/>
+              <w:end w:w="80" w:type="dxa"/>
+            </w:tcMar>
+            <w:vAlign w:val="center"/>
+          </w:tcPr>
+          <w:p>
+            <w:pPr>
+              <w:spacing w:after="0"/>
+            </w:pPr>
+            <w:r>
+              <w:rPr>
+                <w:b w:val="0"/>
+                <w:bCs/>
+                <w:sz w:val="20"/>
                 <w:szCs w:val="20"/>
               </w:rPr>
               <w:t>P4</w:t>
@@ -1837,19 +1992,24 @@
           <w:tcPr>
             <w:tcW w:type="dxa" w:w="4626"/>
             <w:tcMar>
-              <w:top w:type="dxa" w:w="80"/>
-              <w:left w:type="dxa" w:w="100"/>
-              <w:bottom w:type="dxa" w:w="80"/>
-              <w:right w:type="dxa" w:w="100"/>
-            </w:tcMar>
-            <w:vAlign w:val="center"/>
-          </w:tcPr>
-          <w:p>
-            <w:r>
-              <w:rPr>
-                <w:b w:val="0"/>
-                <w:bCs/>
-                <w:sz w:val="17"/>
+              <w:top w:type="dxa" w:w="30"/>
+              <w:left w:type="dxa" w:w="100"/>
+              <w:bottom w:type="dxa" w:w="30"/>
+              <w:right w:type="dxa" w:w="100"/>
+              <w:start w:w="80" w:type="dxa"/>
+              <w:end w:w="80" w:type="dxa"/>
+            </w:tcMar>
+            <w:vAlign w:val="center"/>
+          </w:tcPr>
+          <w:p>
+            <w:pPr>
+              <w:spacing w:after="0"/>
+            </w:pPr>
+            <w:r>
+              <w:rPr>
+                <w:b w:val="0"/>
+                <w:bCs/>
+                <w:sz w:val="20"/>
                 <w:szCs w:val="20"/>
               </w:rPr>
               <w:t>metrics.py : information_ratio</w:t>
@@ -1865,19 +2025,24 @@
           <w:tcPr>
             <w:tcW w:type="dxa" w:w="2500"/>
             <w:tcMar>
-              <w:top w:type="dxa" w:w="80"/>
-              <w:left w:type="dxa" w:w="100"/>
-              <w:bottom w:type="dxa" w:w="80"/>
-              <w:right w:type="dxa" w:w="100"/>
-            </w:tcMar>
-            <w:vAlign w:val="center"/>
-          </w:tcPr>
-          <w:p>
-            <w:r>
-              <w:rPr>
-                <w:b w:val="0"/>
-                <w:bCs/>
-                <w:sz w:val="17"/>
+              <w:top w:type="dxa" w:w="30"/>
+              <w:left w:type="dxa" w:w="100"/>
+              <w:bottom w:type="dxa" w:w="30"/>
+              <w:right w:type="dxa" w:w="100"/>
+              <w:start w:w="80" w:type="dxa"/>
+              <w:end w:w="80" w:type="dxa"/>
+            </w:tcMar>
+            <w:vAlign w:val="center"/>
+          </w:tcPr>
+          <w:p>
+            <w:pPr>
+              <w:spacing w:after="0"/>
+            </w:pPr>
+            <w:r>
+              <w:rPr>
+                <w:b w:val="0"/>
+                <w:bCs/>
+                <w:sz w:val="20"/>
                 <w:szCs w:val="20"/>
               </w:rPr>
               <w:t>Turnover / coûts</w:t>
@@ -1888,19 +2053,24 @@
           <w:tcPr>
             <w:tcW w:type="dxa" w:w="1900"/>
             <w:tcMar>
-              <w:top w:type="dxa" w:w="80"/>
-              <w:left w:type="dxa" w:w="100"/>
-              <w:bottom w:type="dxa" w:w="80"/>
-              <w:right w:type="dxa" w:w="100"/>
-            </w:tcMar>
-            <w:vAlign w:val="center"/>
-          </w:tcPr>
-          <w:p>
-            <w:r>
-              <w:rPr>
-                <w:b w:val="0"/>
-                <w:bCs/>
-                <w:sz w:val="17"/>
+              <w:top w:type="dxa" w:w="30"/>
+              <w:left w:type="dxa" w:w="100"/>
+              <w:bottom w:type="dxa" w:w="30"/>
+              <w:right w:type="dxa" w:w="100"/>
+              <w:start w:w="80" w:type="dxa"/>
+              <w:end w:w="80" w:type="dxa"/>
+            </w:tcMar>
+            <w:vAlign w:val="center"/>
+          </w:tcPr>
+          <w:p>
+            <w:pPr>
+              <w:spacing w:after="0"/>
+            </w:pPr>
+            <w:r>
+              <w:rPr>
+                <w:b w:val="0"/>
+                <w:bCs/>
+                <w:sz w:val="20"/>
                 <w:szCs w:val="20"/>
               </w:rPr>
               <w:t>P1, P3 (réalisme)</w:t>
@@ -1911,19 +2081,24 @@
           <w:tcPr>
             <w:tcW w:type="dxa" w:w="4626"/>
             <w:tcMar>
-              <w:top w:type="dxa" w:w="80"/>
-              <w:left w:type="dxa" w:w="100"/>
-              <w:bottom w:type="dxa" w:w="80"/>
-              <w:right w:type="dxa" w:w="100"/>
-            </w:tcMar>
-            <w:vAlign w:val="center"/>
-          </w:tcPr>
-          <w:p>
-            <w:r>
-              <w:rPr>
-                <w:b w:val="0"/>
-                <w:bCs/>
-                <w:sz w:val="17"/>
+              <w:top w:type="dxa" w:w="30"/>
+              <w:left w:type="dxa" w:w="100"/>
+              <w:bottom w:type="dxa" w:w="30"/>
+              <w:right w:type="dxa" w:w="100"/>
+              <w:start w:w="80" w:type="dxa"/>
+              <w:end w:w="80" w:type="dxa"/>
+            </w:tcMar>
+            <w:vAlign w:val="center"/>
+          </w:tcPr>
+          <w:p>
+            <w:pPr>
+              <w:spacing w:after="0"/>
+            </w:pPr>
+            <w:r>
+              <w:rPr>
+                <w:b w:val="0"/>
+                <w:bCs/>
+                <w:sz w:val="20"/>
                 <w:szCs w:val="20"/>
               </w:rPr>
               <w:t>backtest.py : run_backtest, build_cost_vector</w:t>
@@ -1939,19 +2114,24 @@
           <w:tcPr>
             <w:tcW w:type="dxa" w:w="2500"/>
             <w:tcMar>
-              <w:top w:type="dxa" w:w="80"/>
-              <w:left w:type="dxa" w:w="100"/>
-              <w:bottom w:type="dxa" w:w="80"/>
-              <w:right w:type="dxa" w:w="100"/>
-            </w:tcMar>
-            <w:vAlign w:val="center"/>
-          </w:tcPr>
-          <w:p>
-            <w:r>
-              <w:rPr>
-                <w:b w:val="0"/>
-                <w:bCs/>
-                <w:sz w:val="17"/>
+              <w:top w:type="dxa" w:w="30"/>
+              <w:left w:type="dxa" w:w="100"/>
+              <w:bottom w:type="dxa" w:w="30"/>
+              <w:right w:type="dxa" w:w="100"/>
+              <w:start w:w="80" w:type="dxa"/>
+              <w:end w:w="80" w:type="dxa"/>
+            </w:tcMar>
+            <w:vAlign w:val="center"/>
+          </w:tcPr>
+          <w:p>
+            <w:pPr>
+              <w:spacing w:after="0"/>
+            </w:pPr>
+            <w:r>
+              <w:rPr>
+                <w:b w:val="0"/>
+                <w:bCs/>
+                <w:sz w:val="20"/>
                 <w:szCs w:val="20"/>
               </w:rPr>
               <w:t>Deflated Sharpe Ratio</w:t>
@@ -1962,19 +2142,24 @@
           <w:tcPr>
             <w:tcW w:type="dxa" w:w="1900"/>
             <w:tcMar>
-              <w:top w:type="dxa" w:w="80"/>
-              <w:left w:type="dxa" w:w="100"/>
-              <w:bottom w:type="dxa" w:w="80"/>
-              <w:right w:type="dxa" w:w="100"/>
-            </w:tcMar>
-            <w:vAlign w:val="center"/>
-          </w:tcPr>
-          <w:p>
-            <w:r>
-              <w:rPr>
-                <w:b w:val="0"/>
-                <w:bCs/>
-                <w:sz w:val="17"/>
+              <w:top w:type="dxa" w:w="30"/>
+              <w:left w:type="dxa" w:w="100"/>
+              <w:bottom w:type="dxa" w:w="30"/>
+              <w:right w:type="dxa" w:w="100"/>
+              <w:start w:w="80" w:type="dxa"/>
+              <w:end w:w="80" w:type="dxa"/>
+            </w:tcMar>
+            <w:vAlign w:val="center"/>
+          </w:tcPr>
+          <w:p>
+            <w:pPr>
+              <w:spacing w:after="0"/>
+            </w:pPr>
+            <w:r>
+              <w:rPr>
+                <w:b w:val="0"/>
+                <w:bCs/>
+                <w:sz w:val="20"/>
                 <w:szCs w:val="20"/>
               </w:rPr>
               <w:t>P4</w:t>
@@ -1985,19 +2170,24 @@
           <w:tcPr>
             <w:tcW w:type="dxa" w:w="4626"/>
             <w:tcMar>
-              <w:top w:type="dxa" w:w="80"/>
-              <w:left w:type="dxa" w:w="100"/>
-              <w:bottom w:type="dxa" w:w="80"/>
-              <w:right w:type="dxa" w:w="100"/>
-            </w:tcMar>
-            <w:vAlign w:val="center"/>
-          </w:tcPr>
-          <w:p>
-            <w:r>
-              <w:rPr>
-                <w:b w:val="0"/>
-                <w:bCs/>
-                <w:sz w:val="17"/>
+              <w:top w:type="dxa" w:w="30"/>
+              <w:left w:type="dxa" w:w="100"/>
+              <w:bottom w:type="dxa" w:w="30"/>
+              <w:right w:type="dxa" w:w="100"/>
+              <w:start w:w="80" w:type="dxa"/>
+              <w:end w:w="80" w:type="dxa"/>
+            </w:tcMar>
+            <w:vAlign w:val="center"/>
+          </w:tcPr>
+          <w:p>
+            <w:pPr>
+              <w:spacing w:after="0"/>
+            </w:pPr>
+            <w:r>
+              <w:rPr>
+                <w:b w:val="0"/>
+                <w:bCs/>
+                <w:sz w:val="20"/>
                 <w:szCs w:val="20"/>
               </w:rPr>
               <w:t>metrics.py : deflated_sharpe_ratio</w:t>
@@ -2013,19 +2203,24 @@
           <w:tcPr>
             <w:tcW w:type="dxa" w:w="2500"/>
             <w:tcMar>
-              <w:top w:type="dxa" w:w="80"/>
-              <w:left w:type="dxa" w:w="100"/>
-              <w:bottom w:type="dxa" w:w="80"/>
-              <w:right w:type="dxa" w:w="100"/>
-            </w:tcMar>
-            <w:vAlign w:val="center"/>
-          </w:tcPr>
-          <w:p>
-            <w:r>
-              <w:rPr>
-                <w:b w:val="0"/>
-                <w:bCs/>
-                <w:sz w:val="17"/>
+              <w:top w:type="dxa" w:w="30"/>
+              <w:left w:type="dxa" w:w="100"/>
+              <w:bottom w:type="dxa" w:w="30"/>
+              <w:right w:type="dxa" w:w="100"/>
+              <w:start w:w="80" w:type="dxa"/>
+              <w:end w:w="80" w:type="dxa"/>
+            </w:tcMar>
+            <w:vAlign w:val="center"/>
+          </w:tcPr>
+          <w:p>
+            <w:pPr>
+              <w:spacing w:after="0"/>
+            </w:pPr>
+            <w:r>
+              <w:rPr>
+                <w:b w:val="0"/>
+                <w:bCs/>
+                <w:sz w:val="20"/>
                 <w:szCs w:val="20"/>
               </w:rPr>
               <w:t>IC bootstrap par blocs</w:t>
@@ -2036,19 +2231,24 @@
           <w:tcPr>
             <w:tcW w:type="dxa" w:w="1900"/>
             <w:tcMar>
-              <w:top w:type="dxa" w:w="80"/>
-              <w:left w:type="dxa" w:w="100"/>
-              <w:bottom w:type="dxa" w:w="80"/>
-              <w:right w:type="dxa" w:w="100"/>
-            </w:tcMar>
-            <w:vAlign w:val="center"/>
-          </w:tcPr>
-          <w:p>
-            <w:r>
-              <w:rPr>
-                <w:b w:val="0"/>
-                <w:bCs/>
-                <w:sz w:val="17"/>
+              <w:top w:type="dxa" w:w="30"/>
+              <w:left w:type="dxa" w:w="100"/>
+              <w:bottom w:type="dxa" w:w="30"/>
+              <w:right w:type="dxa" w:w="100"/>
+              <w:start w:w="80" w:type="dxa"/>
+              <w:end w:w="80" w:type="dxa"/>
+            </w:tcMar>
+            <w:vAlign w:val="center"/>
+          </w:tcPr>
+          <w:p>
+            <w:pPr>
+              <w:spacing w:after="0"/>
+            </w:pPr>
+            <w:r>
+              <w:rPr>
+                <w:b w:val="0"/>
+                <w:bCs/>
+                <w:sz w:val="20"/>
                 <w:szCs w:val="20"/>
               </w:rPr>
               <w:t>P4</w:t>
@@ -2059,19 +2259,24 @@
           <w:tcPr>
             <w:tcW w:type="dxa" w:w="4626"/>
             <w:tcMar>
-              <w:top w:type="dxa" w:w="80"/>
-              <w:left w:type="dxa" w:w="100"/>
-              <w:bottom w:type="dxa" w:w="80"/>
-              <w:right w:type="dxa" w:w="100"/>
-            </w:tcMar>
-            <w:vAlign w:val="center"/>
-          </w:tcPr>
-          <w:p>
-            <w:r>
-              <w:rPr>
-                <w:b w:val="0"/>
-                <w:bCs/>
-                <w:sz w:val="17"/>
+              <w:top w:type="dxa" w:w="30"/>
+              <w:left w:type="dxa" w:w="100"/>
+              <w:bottom w:type="dxa" w:w="30"/>
+              <w:right w:type="dxa" w:w="100"/>
+              <w:start w:w="80" w:type="dxa"/>
+              <w:end w:w="80" w:type="dxa"/>
+            </w:tcMar>
+            <w:vAlign w:val="center"/>
+          </w:tcPr>
+          <w:p>
+            <w:pPr>
+              <w:spacing w:after="0"/>
+            </w:pPr>
+            <w:r>
+              <w:rPr>
+                <w:b w:val="0"/>
+                <w:bCs/>
+                <w:sz w:val="20"/>
                 <w:szCs w:val="20"/>
               </w:rPr>
               <w:t>metrics.py : block_bootstrap_sharpe_ci</w:t>
@@ -2087,19 +2292,24 @@
           <w:tcPr>
             <w:tcW w:type="dxa" w:w="2500"/>
             <w:tcMar>
-              <w:top w:type="dxa" w:w="80"/>
-              <w:left w:type="dxa" w:w="100"/>
-              <w:bottom w:type="dxa" w:w="80"/>
-              <w:right w:type="dxa" w:w="100"/>
-            </w:tcMar>
-            <w:vAlign w:val="center"/>
-          </w:tcPr>
-          <w:p>
-            <w:r>
-              <w:rPr>
-                <w:b w:val="0"/>
-                <w:bCs/>
-                <w:sz w:val="17"/>
+              <w:top w:type="dxa" w:w="30"/>
+              <w:left w:type="dxa" w:w="100"/>
+              <w:bottom w:type="dxa" w:w="30"/>
+              <w:right w:type="dxa" w:w="100"/>
+              <w:start w:w="80" w:type="dxa"/>
+              <w:end w:w="80" w:type="dxa"/>
+            </w:tcMar>
+            <w:vAlign w:val="center"/>
+          </w:tcPr>
+          <w:p>
+            <w:pPr>
+              <w:spacing w:after="0"/>
+            </w:pPr>
+            <w:r>
+              <w:rPr>
+                <w:b w:val="0"/>
+                <w:bCs/>
+                <w:sz w:val="20"/>
                 <w:szCs w:val="20"/>
               </w:rPr>
               <w:t>Registre des essais (N)</w:t>
@@ -2110,19 +2320,24 @@
           <w:tcPr>
             <w:tcW w:type="dxa" w:w="1900"/>
             <w:tcMar>
-              <w:top w:type="dxa" w:w="80"/>
-              <w:left w:type="dxa" w:w="100"/>
-              <w:bottom w:type="dxa" w:w="80"/>
-              <w:right w:type="dxa" w:w="100"/>
-            </w:tcMar>
-            <w:vAlign w:val="center"/>
-          </w:tcPr>
-          <w:p>
-            <w:r>
-              <w:rPr>
-                <w:b w:val="0"/>
-                <w:bCs/>
-                <w:sz w:val="17"/>
+              <w:top w:type="dxa" w:w="30"/>
+              <w:left w:type="dxa" w:w="100"/>
+              <w:bottom w:type="dxa" w:w="30"/>
+              <w:right w:type="dxa" w:w="100"/>
+              <w:start w:w="80" w:type="dxa"/>
+              <w:end w:w="80" w:type="dxa"/>
+            </w:tcMar>
+            <w:vAlign w:val="center"/>
+          </w:tcPr>
+          <w:p>
+            <w:pPr>
+              <w:spacing w:after="0"/>
+            </w:pPr>
+            <w:r>
+              <w:rPr>
+                <w:b w:val="0"/>
+                <w:bCs/>
+                <w:sz w:val="20"/>
                 <w:szCs w:val="20"/>
               </w:rPr>
               <w:t>P4</w:t>
@@ -2133,19 +2348,24 @@
           <w:tcPr>
             <w:tcW w:type="dxa" w:w="4626"/>
             <w:tcMar>
-              <w:top w:type="dxa" w:w="80"/>
-              <w:left w:type="dxa" w:w="100"/>
-              <w:bottom w:type="dxa" w:w="80"/>
-              <w:right w:type="dxa" w:w="100"/>
-            </w:tcMar>
-            <w:vAlign w:val="center"/>
-          </w:tcPr>
-          <w:p>
-            <w:r>
-              <w:rPr>
-                <w:b w:val="0"/>
-                <w:bCs/>
-                <w:sz w:val="17"/>
+              <w:top w:type="dxa" w:w="30"/>
+              <w:left w:type="dxa" w:w="100"/>
+              <w:bottom w:type="dxa" w:w="30"/>
+              <w:right w:type="dxa" w:w="100"/>
+              <w:start w:w="80" w:type="dxa"/>
+              <w:end w:w="80" w:type="dxa"/>
+            </w:tcMar>
+            <w:vAlign w:val="center"/>
+          </w:tcPr>
+          <w:p>
+            <w:pPr>
+              <w:spacing w:after="0"/>
+            </w:pPr>
+            <w:r>
+              <w:rPr>
+                <w:b w:val="0"/>
+                <w:bCs/>
+                <w:sz w:val="20"/>
                 <w:szCs w:val="20"/>
               </w:rPr>
               <w:t>metrics.py : DSRTrialLedger</w:t>
@@ -2161,19 +2381,24 @@
           <w:tcPr>
             <w:tcW w:type="dxa" w:w="2500"/>
             <w:tcMar>
-              <w:top w:type="dxa" w:w="80"/>
-              <w:left w:type="dxa" w:w="100"/>
-              <w:bottom w:type="dxa" w:w="80"/>
-              <w:right w:type="dxa" w:w="100"/>
-            </w:tcMar>
-            <w:vAlign w:val="center"/>
-          </w:tcPr>
-          <w:p>
-            <w:r>
-              <w:rPr>
-                <w:b w:val="0"/>
-                <w:bCs/>
-                <w:sz w:val="17"/>
+              <w:top w:type="dxa" w:w="30"/>
+              <w:left w:type="dxa" w:w="100"/>
+              <w:bottom w:type="dxa" w:w="30"/>
+              <w:right w:type="dxa" w:w="100"/>
+              <w:start w:w="80" w:type="dxa"/>
+              <w:end w:w="80" w:type="dxa"/>
+            </w:tcMar>
+            <w:vAlign w:val="center"/>
+          </w:tcPr>
+          <w:p>
+            <w:pPr>
+              <w:spacing w:after="0"/>
+            </w:pPr>
+            <w:r>
+              <w:rPr>
+                <w:b w:val="0"/>
+                <w:bCs/>
+                <w:sz w:val="20"/>
                 <w:szCs w:val="20"/>
               </w:rPr>
               <w:t>Coefficient d'information</w:t>
@@ -2184,19 +2409,24 @@
           <w:tcPr>
             <w:tcW w:type="dxa" w:w="1900"/>
             <w:tcMar>
-              <w:top w:type="dxa" w:w="80"/>
-              <w:left w:type="dxa" w:w="100"/>
-              <w:bottom w:type="dxa" w:w="80"/>
-              <w:right w:type="dxa" w:w="100"/>
-            </w:tcMar>
-            <w:vAlign w:val="center"/>
-          </w:tcPr>
-          <w:p>
-            <w:r>
-              <w:rPr>
-                <w:b w:val="0"/>
-                <w:bCs/>
-                <w:sz w:val="17"/>
+              <w:top w:type="dxa" w:w="30"/>
+              <w:left w:type="dxa" w:w="100"/>
+              <w:bottom w:type="dxa" w:w="30"/>
+              <w:right w:type="dxa" w:w="100"/>
+              <w:start w:w="80" w:type="dxa"/>
+              <w:end w:w="80" w:type="dxa"/>
+            </w:tcMar>
+            <w:vAlign w:val="center"/>
+          </w:tcPr>
+          <w:p>
+            <w:pPr>
+              <w:spacing w:after="0"/>
+            </w:pPr>
+            <w:r>
+              <w:rPr>
+                <w:b w:val="0"/>
+                <w:bCs/>
+                <w:sz w:val="20"/>
                 <w:szCs w:val="20"/>
               </w:rPr>
               <w:t>P4</w:t>
@@ -2207,19 +2437,24 @@
           <w:tcPr>
             <w:tcW w:type="dxa" w:w="4626"/>
             <w:tcMar>
-              <w:top w:type="dxa" w:w="80"/>
-              <w:left w:type="dxa" w:w="100"/>
-              <w:bottom w:type="dxa" w:w="80"/>
-              <w:right w:type="dxa" w:w="100"/>
-            </w:tcMar>
-            <w:vAlign w:val="center"/>
-          </w:tcPr>
-          <w:p>
-            <w:r>
-              <w:rPr>
-                <w:b w:val="0"/>
-                <w:bCs/>
-                <w:sz w:val="17"/>
+              <w:top w:type="dxa" w:w="30"/>
+              <w:left w:type="dxa" w:w="100"/>
+              <w:bottom w:type="dxa" w:w="30"/>
+              <w:right w:type="dxa" w:w="100"/>
+              <w:start w:w="80" w:type="dxa"/>
+              <w:end w:w="80" w:type="dxa"/>
+            </w:tcMar>
+            <w:vAlign w:val="center"/>
+          </w:tcPr>
+          <w:p>
+            <w:pPr>
+              <w:spacing w:after="0"/>
+            </w:pPr>
+            <w:r>
+              <w:rPr>
+                <w:b w:val="0"/>
+                <w:bCs/>
+                <w:sz w:val="20"/>
                 <w:szCs w:val="20"/>
               </w:rPr>
               <w:t>model_selection.py : information_coefficient</w:t>
@@ -2235,19 +2470,24 @@
           <w:tcPr>
             <w:tcW w:type="dxa" w:w="2500"/>
             <w:tcMar>
-              <w:top w:type="dxa" w:w="80"/>
-              <w:left w:type="dxa" w:w="100"/>
-              <w:bottom w:type="dxa" w:w="80"/>
-              <w:right w:type="dxa" w:w="100"/>
-            </w:tcMar>
-            <w:vAlign w:val="center"/>
-          </w:tcPr>
-          <w:p>
-            <w:r>
-              <w:rPr>
-                <w:b w:val="0"/>
-                <w:bCs/>
-                <w:sz w:val="17"/>
+              <w:top w:type="dxa" w:w="30"/>
+              <w:left w:type="dxa" w:w="100"/>
+              <w:bottom w:type="dxa" w:w="30"/>
+              <w:right w:type="dxa" w:w="100"/>
+              <w:start w:w="80" w:type="dxa"/>
+              <w:end w:w="80" w:type="dxa"/>
+            </w:tcMar>
+            <w:vAlign w:val="center"/>
+          </w:tcPr>
+          <w:p>
+            <w:pPr>
+              <w:spacing w:after="0"/>
+            </w:pPr>
+            <w:r>
+              <w:rPr>
+                <w:b w:val="0"/>
+                <w:bCs/>
+                <w:sz w:val="20"/>
                 <w:szCs w:val="20"/>
               </w:rPr>
               <w:t>ADF + KPSS</w:t>
@@ -2258,19 +2498,24 @@
           <w:tcPr>
             <w:tcW w:type="dxa" w:w="1900"/>
             <w:tcMar>
-              <w:top w:type="dxa" w:w="80"/>
-              <w:left w:type="dxa" w:w="100"/>
-              <w:bottom w:type="dxa" w:w="80"/>
-              <w:right w:type="dxa" w:w="100"/>
-            </w:tcMar>
-            <w:vAlign w:val="center"/>
-          </w:tcPr>
-          <w:p>
-            <w:r>
-              <w:rPr>
-                <w:b w:val="0"/>
-                <w:bCs/>
-                <w:sz w:val="17"/>
+              <w:top w:type="dxa" w:w="30"/>
+              <w:left w:type="dxa" w:w="100"/>
+              <w:bottom w:type="dxa" w:w="30"/>
+              <w:right w:type="dxa" w:w="100"/>
+              <w:start w:w="80" w:type="dxa"/>
+              <w:end w:w="80" w:type="dxa"/>
+            </w:tcMar>
+            <w:vAlign w:val="center"/>
+          </w:tcPr>
+          <w:p>
+            <w:pPr>
+              <w:spacing w:after="0"/>
+            </w:pPr>
+            <w:r>
+              <w:rPr>
+                <w:b w:val="0"/>
+                <w:bCs/>
+                <w:sz w:val="20"/>
                 <w:szCs w:val="20"/>
               </w:rPr>
               <w:t>P2</w:t>
@@ -2281,19 +2526,24 @@
           <w:tcPr>
             <w:tcW w:type="dxa" w:w="4626"/>
             <w:tcMar>
-              <w:top w:type="dxa" w:w="80"/>
-              <w:left w:type="dxa" w:w="100"/>
-              <w:bottom w:type="dxa" w:w="80"/>
-              <w:right w:type="dxa" w:w="100"/>
-            </w:tcMar>
-            <w:vAlign w:val="center"/>
-          </w:tcPr>
-          <w:p>
-            <w:r>
-              <w:rPr>
-                <w:b w:val="0"/>
-                <w:bCs/>
-                <w:sz w:val="17"/>
+              <w:top w:type="dxa" w:w="30"/>
+              <w:left w:type="dxa" w:w="100"/>
+              <w:bottom w:type="dxa" w:w="30"/>
+              <w:right w:type="dxa" w:w="100"/>
+              <w:start w:w="80" w:type="dxa"/>
+              <w:end w:w="80" w:type="dxa"/>
+            </w:tcMar>
+            <w:vAlign w:val="center"/>
+          </w:tcPr>
+          <w:p>
+            <w:pPr>
+              <w:spacing w:after="0"/>
+            </w:pPr>
+            <w:r>
+              <w:rPr>
+                <w:b w:val="0"/>
+                <w:bCs/>
+                <w:sz w:val="20"/>
                 <w:szCs w:val="20"/>
               </w:rPr>
               <w:t>features.py : run_stationarity_tests</w:t>
@@ -2309,19 +2559,24 @@
           <w:tcPr>
             <w:tcW w:type="dxa" w:w="2500"/>
             <w:tcMar>
-              <w:top w:type="dxa" w:w="80"/>
-              <w:left w:type="dxa" w:w="100"/>
-              <w:bottom w:type="dxa" w:w="80"/>
-              <w:right w:type="dxa" w:w="100"/>
-            </w:tcMar>
-            <w:vAlign w:val="center"/>
-          </w:tcPr>
-          <w:p>
-            <w:r>
-              <w:rPr>
-                <w:b w:val="0"/>
-                <w:bCs/>
-                <w:sz w:val="17"/>
+              <w:top w:type="dxa" w:w="30"/>
+              <w:left w:type="dxa" w:w="100"/>
+              <w:bottom w:type="dxa" w:w="30"/>
+              <w:right w:type="dxa" w:w="100"/>
+              <w:start w:w="80" w:type="dxa"/>
+              <w:end w:w="80" w:type="dxa"/>
+            </w:tcMar>
+            <w:vAlign w:val="center"/>
+          </w:tcPr>
+          <w:p>
+            <w:pPr>
+              <w:spacing w:after="0"/>
+            </w:pPr>
+            <w:r>
+              <w:rPr>
+                <w:b w:val="0"/>
+                <w:bCs/>
+                <w:sz w:val="20"/>
                 <w:szCs w:val="20"/>
               </w:rPr>
               <w:t>Panneau agrégé</w:t>
@@ -2332,19 +2587,24 @@
           <w:tcPr>
             <w:tcW w:type="dxa" w:w="1900"/>
             <w:tcMar>
-              <w:top w:type="dxa" w:w="80"/>
-              <w:left w:type="dxa" w:w="100"/>
-              <w:bottom w:type="dxa" w:w="80"/>
-              <w:right w:type="dxa" w:w="100"/>
-            </w:tcMar>
-            <w:vAlign w:val="center"/>
-          </w:tcPr>
-          <w:p>
-            <w:r>
-              <w:rPr>
-                <w:b w:val="0"/>
-                <w:bCs/>
-                <w:sz w:val="17"/>
+              <w:top w:type="dxa" w:w="30"/>
+              <w:left w:type="dxa" w:w="100"/>
+              <w:bottom w:type="dxa" w:w="30"/>
+              <w:right w:type="dxa" w:w="100"/>
+              <w:start w:w="80" w:type="dxa"/>
+              <w:end w:w="80" w:type="dxa"/>
+            </w:tcMar>
+            <w:vAlign w:val="center"/>
+          </w:tcPr>
+          <w:p>
+            <w:pPr>
+              <w:spacing w:after="0"/>
+            </w:pPr>
+            <w:r>
+              <w:rPr>
+                <w:b w:val="0"/>
+                <w:bCs/>
+                <w:sz w:val="20"/>
                 <w:szCs w:val="20"/>
               </w:rPr>
               <w:t>P4</w:t>
@@ -2355,22 +2615,163 @@
           <w:tcPr>
             <w:tcW w:type="dxa" w:w="4626"/>
             <w:tcMar>
-              <w:top w:type="dxa" w:w="80"/>
-              <w:left w:type="dxa" w:w="100"/>
-              <w:bottom w:type="dxa" w:w="80"/>
-              <w:right w:type="dxa" w:w="100"/>
-            </w:tcMar>
-            <w:vAlign w:val="center"/>
-          </w:tcPr>
-          <w:p>
-            <w:r>
-              <w:rPr>
-                <w:b w:val="0"/>
-                <w:bCs/>
-                <w:sz w:val="17"/>
+              <w:top w:type="dxa" w:w="30"/>
+              <w:left w:type="dxa" w:w="100"/>
+              <w:bottom w:type="dxa" w:w="30"/>
+              <w:right w:type="dxa" w:w="100"/>
+              <w:start w:w="80" w:type="dxa"/>
+              <w:end w:w="80" w:type="dxa"/>
+            </w:tcMar>
+            <w:vAlign w:val="center"/>
+          </w:tcPr>
+          <w:p>
+            <w:pPr>
+              <w:spacing w:after="0"/>
+            </w:pPr>
+            <w:r>
+              <w:rPr>
+                <w:b w:val="0"/>
+                <w:bCs/>
+                <w:sz w:val="20"/>
                 <w:szCs w:val="20"/>
               </w:rPr>
               <w:t>metrics.py : summarize</w:t>
+            </w:r>
+          </w:p>
+        </w:tc>
+      </w:tr>
+      <w:tr>
+        <w:tc>
+          <w:tcPr>
+            <w:tcW w:type="dxa" w:w="2500"/>
+            <w:tcMar>
+              <w:top w:w="30" w:type="dxa"/>
+              <w:bottom w:w="30" w:type="dxa"/>
+              <w:start w:w="80" w:type="dxa"/>
+              <w:end w:w="80" w:type="dxa"/>
+            </w:tcMar>
+          </w:tcPr>
+          <w:p>
+            <w:pPr>
+              <w:spacing w:after="0"/>
+            </w:pPr>
+            <w:r>
+              <w:rPr>
+                <w:sz w:val="20"/>
+              </w:rPr>
+              <w:t>Bootstrap pairé</w:t>
+            </w:r>
+          </w:p>
+        </w:tc>
+        <w:tc>
+          <w:tcPr>
+            <w:tcW w:type="dxa" w:w="1900"/>
+            <w:tcMar>
+              <w:top w:w="30" w:type="dxa"/>
+              <w:bottom w:w="30" w:type="dxa"/>
+              <w:start w:w="80" w:type="dxa"/>
+              <w:end w:w="80" w:type="dxa"/>
+            </w:tcMar>
+          </w:tcPr>
+          <w:p>
+            <w:pPr>
+              <w:spacing w:after="0"/>
+            </w:pPr>
+            <w:r>
+              <w:rPr>
+                <w:sz w:val="20"/>
+              </w:rPr>
+              <w:t>P4</w:t>
+            </w:r>
+          </w:p>
+        </w:tc>
+        <w:tc>
+          <w:tcPr>
+            <w:tcW w:type="dxa" w:w="4626"/>
+            <w:tcMar>
+              <w:top w:w="30" w:type="dxa"/>
+              <w:bottom w:w="30" w:type="dxa"/>
+              <w:start w:w="80" w:type="dxa"/>
+              <w:end w:w="80" w:type="dxa"/>
+            </w:tcMar>
+          </w:tcPr>
+          <w:p>
+            <w:pPr>
+              <w:spacing w:after="0"/>
+            </w:pPr>
+            <w:r>
+              <w:rPr>
+                <w:sz w:val="20"/>
+              </w:rPr>
+              <w:t>metrics.py : paired_block_bootstrap</w:t>
+            </w:r>
+          </w:p>
+        </w:tc>
+      </w:tr>
+      <w:tr>
+        <w:tc>
+          <w:tcPr>
+            <w:tcW w:type="dxa" w:w="2500"/>
+            <w:tcMar>
+              <w:top w:w="30" w:type="dxa"/>
+              <w:bottom w:w="30" w:type="dxa"/>
+              <w:start w:w="80" w:type="dxa"/>
+              <w:end w:w="80" w:type="dxa"/>
+            </w:tcMar>
+          </w:tcPr>
+          <w:p>
+            <w:pPr>
+              <w:spacing w:after="0"/>
+            </w:pPr>
+            <w:r>
+              <w:rPr>
+                <w:sz w:val="20"/>
+              </w:rPr>
+              <w:t>White RC + Hansen SPA</w:t>
+            </w:r>
+          </w:p>
+        </w:tc>
+        <w:tc>
+          <w:tcPr>
+            <w:tcW w:type="dxa" w:w="1900"/>
+            <w:tcMar>
+              <w:top w:w="30" w:type="dxa"/>
+              <w:bottom w:w="30" w:type="dxa"/>
+              <w:start w:w="80" w:type="dxa"/>
+              <w:end w:w="80" w:type="dxa"/>
+            </w:tcMar>
+          </w:tcPr>
+          <w:p>
+            <w:pPr>
+              <w:spacing w:after="0"/>
+            </w:pPr>
+            <w:r>
+              <w:rPr>
+                <w:sz w:val="20"/>
+              </w:rPr>
+              <w:t>P4</w:t>
+            </w:r>
+          </w:p>
+        </w:tc>
+        <w:tc>
+          <w:tcPr>
+            <w:tcW w:type="dxa" w:w="4626"/>
+            <w:tcMar>
+              <w:top w:w="30" w:type="dxa"/>
+              <w:bottom w:w="30" w:type="dxa"/>
+              <w:start w:w="80" w:type="dxa"/>
+              <w:end w:w="80" w:type="dxa"/>
+            </w:tcMar>
+          </w:tcPr>
+          <w:p>
+            <w:pPr>
+              <w:spacing w:after="0"/>
+            </w:pPr>
+            <w:r>
+              <w:rPr>
+                <w:sz w:val="20"/>
+              </w:rPr>
+              <w:t>reality_check.py : evaluate_candidate_set</w:t>
             </w:r>
           </w:p>
         </w:tc>
@@ -2381,17 +2782,6 @@
         <w:spacing w:after="160"/>
       </w:pPr>
       <w:r/>
-    </w:p>
-    <w:p>
-      <w:pPr>
-        <w:spacing w:after="160"/>
-      </w:pPr>
-      <w:r>
-        <w:rPr>
-          <w:color w:val="000000"/>
-        </w:rPr>
-        <w:t>Lecture d'ensemble. Les mesures de la section 3 sont conventionnelles : elles figureraient dans n'importe quel backtest. Ce sont les sections 4 et 7 qui répondent à « est-ce réel ? » plutôt qu'à « est-ce bon ? », et ce sont elles qui permettent de dire ce qui est établi et ce qui ne l'est pas, au lieu de publier une estimation ponctuelle en espérant qu'elle tienne. La formulation licite est « aucune surperformance n'est établie », jamais « les stratégies sont équivalentes » : une équivalence demanderait un test dédié contre une marge fixée à l'avance, qui n'a pas été mené.</w:t>
-      </w:r>
     </w:p>
     <w:sectPr>
       <w:headerReference w:type="default" r:id="rId7"/>

</xml_diff>